<commit_message>
SimpleStudent with Flutter Mobile project updates for iOS
</commit_message>
<xml_diff>
--- a/Swagger-integration/Flutter-Setup_Guide_EN.docx
+++ b/Swagger-integration/Flutter-Setup_Guide_EN.docx
@@ -16881,6 +16881,127 @@
           </w:p>
         </w:tc>
       </w:tr>
+      <w:tr>
+        <w:trPr>
+          <w:cantSplit/>
+        </w:trPr>
+        <w:tc>
+          <w:tcPr>
+            <w:tcW w:type="dxa" w:w="3300"/>
+            <w:tcBorders>
+              <w:top w:val="single" w:color="D5DDDA" w:sz="4"/>
+              <w:left w:val="single" w:color="D5DDDA" w:sz="4"/>
+              <w:bottom w:val="single" w:color="D5DDDA" w:sz="4"/>
+              <w:right w:val="single" w:color="D5DDDA" w:sz="4"/>
+            </w:tcBorders>
+            <w:shd w:fill="FFFFFF" w:color="auto" w:val="clear"/>
+            <w:tcMar>
+              <w:top w:type="dxa" w:w="60"/>
+              <w:left w:type="dxa" w:w="100"/>
+              <w:bottom w:type="dxa" w:w="60"/>
+              <w:right w:type="dxa" w:w="100"/>
+            </w:tcMar>
+          </w:tcPr>
+          <w:p>
+            <w:pPr>
+              <w:spacing w:after="0" w:before="0" w:line="260"/>
+            </w:pPr>
+            <w:r>
+              <w:rPr>
+                <w:rFonts w:ascii="Arial" w:cs="Arial" w:eastAsia="Arial" w:hAnsi="Arial"/>
+                <w:color w:val="333333"/>
+                <w:sz w:val="18"/>
+                <w:szCs w:val="18"/>
+              </w:rPr>
+              <w:t xml:space="preserve">Install on iPhone/iPad so it opens from the home screen</w:t>
+            </w:r>
+          </w:p>
+        </w:tc>
+        <w:tc>
+          <w:tcPr>
+            <w:tcW w:type="dxa" w:w="2900"/>
+            <w:tcBorders>
+              <w:top w:val="single" w:color="D5DDDA" w:sz="4"/>
+              <w:left w:val="single" w:color="D5DDDA" w:sz="4"/>
+              <w:bottom w:val="single" w:color="D5DDDA" w:sz="4"/>
+              <w:right w:val="single" w:color="D5DDDA" w:sz="4"/>
+            </w:tcBorders>
+            <w:shd w:fill="FFFFFF" w:color="auto" w:val="clear"/>
+            <w:tcMar>
+              <w:top w:type="dxa" w:w="60"/>
+              <w:left w:type="dxa" w:w="100"/>
+              <w:bottom w:type="dxa" w:w="60"/>
+              <w:right w:type="dxa" w:w="100"/>
+            </w:tcMar>
+          </w:tcPr>
+          <w:p>
+            <w:pPr>
+              <w:spacing w:after="0" w:before="0" w:line="260"/>
+            </w:pPr>
+            <w:r>
+              <w:rPr>
+                <w:rFonts w:ascii="Consolas" w:cs="Consolas" w:eastAsia="Consolas" w:hAnsi="Consolas"/>
+                <w:color w:val="12433C"/>
+                <w:sz w:val="16"/>
+                <w:szCs w:val="16"/>
+                <w:shd w:fill="F3F6F5" w:color="auto" w:val="clear"/>
+              </w:rPr>
+              <w:t xml:space="preserve">flutter run --release -d &lt;ID&gt;</w:t>
+            </w:r>
+          </w:p>
+        </w:tc>
+        <w:tc>
+          <w:tcPr>
+            <w:tcW w:type="dxa" w:w="3438"/>
+            <w:tcBorders>
+              <w:top w:val="single" w:color="D5DDDA" w:sz="4"/>
+              <w:left w:val="single" w:color="D5DDDA" w:sz="4"/>
+              <w:bottom w:val="single" w:color="D5DDDA" w:sz="4"/>
+              <w:right w:val="single" w:color="D5DDDA" w:sz="4"/>
+            </w:tcBorders>
+            <w:shd w:fill="FFFFFF" w:color="auto" w:val="clear"/>
+            <w:tcMar>
+              <w:top w:type="dxa" w:w="60"/>
+              <w:left w:type="dxa" w:w="100"/>
+              <w:bottom w:type="dxa" w:w="60"/>
+              <w:right w:type="dxa" w:w="100"/>
+            </w:tcMar>
+          </w:tcPr>
+          <w:p>
+            <w:pPr>
+              <w:spacing w:after="0" w:before="0" w:line="260"/>
+            </w:pPr>
+            <w:r>
+              <w:rPr>
+                <w:rFonts w:ascii="Arial" w:cs="Arial" w:eastAsia="Arial" w:hAnsi="Arial"/>
+                <w:color w:val="333333"/>
+                <w:sz w:val="18"/>
+                <w:szCs w:val="18"/>
+              </w:rPr>
+              <w:t xml:space="preserve">The release build stays on the device; </w:t>
+            </w:r>
+            <w:r>
+              <w:rPr>
+                <w:rFonts w:ascii="Consolas" w:cs="Consolas" w:eastAsia="Consolas" w:hAnsi="Consolas"/>
+                <w:color w:val="12433C"/>
+                <w:sz w:val="16"/>
+                <w:szCs w:val="16"/>
+                <w:shd w:fill="F3F6F5" w:color="auto" w:val="clear"/>
+              </w:rPr>
+              <w:t xml:space="preserve">q</w:t>
+            </w:r>
+            <w:r>
+              <w:rPr>
+                <w:rFonts w:ascii="Arial" w:cs="Arial" w:eastAsia="Arial" w:hAnsi="Arial"/>
+                <w:color w:val="333333"/>
+                <w:sz w:val="18"/>
+                <w:szCs w:val="18"/>
+              </w:rPr>
+              <w:t xml:space="preserve"> in the terminal to stop</w:t>
+            </w:r>
+          </w:p>
+        </w:tc>
+      </w:tr>
     </w:tbl>
     <w:p>
       <w:pPr>
@@ -16900,6 +17021,312 @@
         </w:rPr>
         <w:t xml:space="preserve">For the lab an APK is enough – you can send it and install it on a phone (allow “Install unknown apps”). The release APK is signed with the debug key, so it is not suitable for Google Play; that needs a separate signing key.</w:t>
       </w:r>
+    </w:p>
+    <w:p>
+      <w:pPr>
+        <w:pStyle w:val="Heading2"/>
+        <w:keepNext/>
+        <w:spacing w:after="100" w:before="240"/>
+      </w:pPr>
+      <w:r>
+        <w:rPr>
+          <w:rFonts w:ascii="Arial" w:cs="Arial" w:eastAsia="Arial" w:hAnsi="Arial"/>
+          <w:b/>
+          <w:bCs/>
+          <w:color w:val="2C7A6E"/>
+          <w:sz w:val="25"/>
+          <w:szCs w:val="25"/>
+        </w:rPr>
+        <w:t xml:space="preserve">12.1 iOS: the app does not open from the home screen</w:t>
+      </w:r>
+    </w:p>
+    <w:p>
+      <w:pPr>
+        <w:spacing w:after="120" w:before="0" w:line="280"/>
+      </w:pPr>
+      <w:r>
+        <w:rPr>
+          <w:rFonts w:ascii="Arial" w:cs="Arial" w:eastAsia="Arial" w:hAnsi="Arial"/>
+          <w:color w:val="333333"/>
+          <w:sz w:val="20"/>
+          <w:szCs w:val="20"/>
+        </w:rPr>
+        <w:t xml:space="preserve">When you open a </w:t>
+      </w:r>
+      <w:r>
+        <w:rPr>
+          <w:rFonts w:ascii="Arial" w:cs="Arial" w:eastAsia="Arial" w:hAnsi="Arial"/>
+          <w:b/>
+          <w:bCs/>
+          <w:color w:val="1E2B28"/>
+          <w:sz w:val="20"/>
+          <w:szCs w:val="20"/>
+        </w:rPr>
+        <w:t xml:space="preserve">debug</w:t>
+      </w:r>
+      <w:r>
+        <w:rPr>
+          <w:rFonts w:ascii="Arial" w:cs="Arial" w:eastAsia="Arial" w:hAnsi="Arial"/>
+          <w:color w:val="333333"/>
+          <w:sz w:val="20"/>
+          <w:szCs w:val="20"/>
+        </w:rPr>
+        <w:t xml:space="preserve"> build from the home screen, the iPhone shows: “In iOS 14+, debug mode Flutter apps can only be launched from Flutter tooling, IDEs with Flutter plugins or from Xcode.” This is an iOS restriction: a debug build (JIT, hot reload) only runs while a debugger is attached. No project setting can change that.</w:t>
+      </w:r>
+    </w:p>
+    <w:p>
+      <w:pPr>
+        <w:spacing w:after="120" w:before="0" w:line="280"/>
+      </w:pPr>
+      <w:r>
+        <w:rPr>
+          <w:rFonts w:ascii="Arial" w:cs="Arial" w:eastAsia="Arial" w:hAnsi="Arial"/>
+          <w:color w:val="333333"/>
+          <w:sz w:val="20"/>
+          <w:szCs w:val="20"/>
+        </w:rPr>
+        <w:t xml:space="preserve">The fix is to install a </w:t>
+      </w:r>
+      <w:r>
+        <w:rPr>
+          <w:rFonts w:ascii="Arial" w:cs="Arial" w:eastAsia="Arial" w:hAnsi="Arial"/>
+          <w:b/>
+          <w:bCs/>
+          <w:color w:val="1E2B28"/>
+          <w:sz w:val="20"/>
+          <w:szCs w:val="20"/>
+        </w:rPr>
+        <w:t xml:space="preserve">release</w:t>
+      </w:r>
+      <w:r>
+        <w:rPr>
+          <w:rFonts w:ascii="Arial" w:cs="Arial" w:eastAsia="Arial" w:hAnsi="Arial"/>
+          <w:color w:val="333333"/>
+          <w:sz w:val="20"/>
+          <w:szCs w:val="20"/>
+        </w:rPr>
+        <w:t xml:space="preserve"> (or profile) build. It opens like a normal app:</w:t>
+      </w:r>
+    </w:p>
+    <w:p>
+      <w:pPr>
+        <w:keepNext/>
+        <w:keepLines/>
+        <w:pBdr>
+          <w:left w:val="single" w:color="2C7A6E" w:sz="18" w:space="6"/>
+        </w:pBdr>
+        <w:shd w:fill="F3F6F5" w:color="auto" w:val="clear"/>
+        <w:spacing w:after="0" w:before="80" w:line="250"/>
+        <w:ind w:left="120" w:right="120"/>
+      </w:pPr>
+      <w:r>
+        <w:rPr>
+          <w:rFonts w:ascii="Consolas" w:cs="Consolas" w:eastAsia="Consolas" w:hAnsi="Consolas"/>
+          <w:color w:val="1E2B28"/>
+          <w:sz w:val="17"/>
+          <w:szCs w:val="17"/>
+        </w:rPr>
+        <w:t xml:space="preserve">flutter devices</w:t>
+      </w:r>
+    </w:p>
+    <w:p>
+      <w:pPr>
+        <w:keepNext w:val="false"/>
+        <w:keepLines/>
+        <w:pBdr>
+          <w:left w:val="single" w:color="2C7A6E" w:sz="18" w:space="6"/>
+        </w:pBdr>
+        <w:shd w:fill="F3F6F5" w:color="auto" w:val="clear"/>
+        <w:spacing w:after="140" w:before="0" w:line="250"/>
+        <w:ind w:left="120" w:right="120"/>
+      </w:pPr>
+      <w:r>
+        <w:rPr>
+          <w:rFonts w:ascii="Consolas" w:cs="Consolas" w:eastAsia="Consolas" w:hAnsi="Consolas"/>
+          <w:color w:val="1E2B28"/>
+          <w:sz w:val="17"/>
+          <w:szCs w:val="17"/>
+        </w:rPr>
+        <w:t xml:space="preserve">flutter run --release -d &lt;iPhone ID&gt; --dart-define=API_BASE_URL=http://&lt;computer IP&gt;:6001</w:t>
+      </w:r>
+    </w:p>
+    <w:p>
+      <w:pPr>
+        <w:pStyle w:val="ListParagraph"/>
+        <w:numPr>
+          <w:ilvl w:val="0"/>
+          <w:numId w:val="6"/>
+        </w:numPr>
+        <w:spacing w:after="60" w:line="270"/>
+      </w:pPr>
+      <w:r>
+        <w:rPr>
+          <w:rFonts w:ascii="Arial" w:cs="Arial" w:eastAsia="Arial" w:hAnsi="Arial"/>
+          <w:color w:val="333333"/>
+          <w:sz w:val="20"/>
+          <w:szCs w:val="20"/>
+        </w:rPr>
+        <w:t xml:space="preserve">After it is installed you can press </w:t>
+      </w:r>
+      <w:r>
+        <w:rPr>
+          <w:rFonts w:ascii="Consolas" w:cs="Consolas" w:eastAsia="Consolas" w:hAnsi="Consolas"/>
+          <w:color w:val="12433C"/>
+          <w:sz w:val="18"/>
+          <w:szCs w:val="18"/>
+          <w:shd w:fill="F3F6F5" w:color="auto" w:val="clear"/>
+        </w:rPr>
+        <w:t xml:space="preserve">q</w:t>
+      </w:r>
+      <w:r>
+        <w:rPr>
+          <w:rFonts w:ascii="Arial" w:cs="Arial" w:eastAsia="Arial" w:hAnsi="Arial"/>
+          <w:color w:val="333333"/>
+          <w:sz w:val="20"/>
+          <w:szCs w:val="20"/>
+        </w:rPr>
+        <w:t xml:space="preserve"> in the terminal – the app stays on the iPhone and opens from the home screen.</w:t>
+      </w:r>
+    </w:p>
+    <w:p>
+      <w:pPr>
+        <w:pStyle w:val="ListParagraph"/>
+        <w:numPr>
+          <w:ilvl w:val="0"/>
+          <w:numId w:val="6"/>
+        </w:numPr>
+        <w:spacing w:after="60" w:line="270"/>
+      </w:pPr>
+      <w:r>
+        <w:rPr>
+          <w:rFonts w:ascii="Arial" w:cs="Arial" w:eastAsia="Arial" w:hAnsi="Arial"/>
+          <w:color w:val="333333"/>
+          <w:sz w:val="20"/>
+          <w:szCs w:val="20"/>
+        </w:rPr>
+        <w:t xml:space="preserve">Release builds have no hot reload – for development keep using the normal </w:t>
+      </w:r>
+      <w:r>
+        <w:rPr>
+          <w:rFonts w:ascii="Consolas" w:cs="Consolas" w:eastAsia="Consolas" w:hAnsi="Consolas"/>
+          <w:color w:val="12433C"/>
+          <w:sz w:val="18"/>
+          <w:szCs w:val="18"/>
+          <w:shd w:fill="F3F6F5" w:color="auto" w:val="clear"/>
+        </w:rPr>
+        <w:t xml:space="preserve">flutter run</w:t>
+      </w:r>
+      <w:r>
+        <w:rPr>
+          <w:rFonts w:ascii="Arial" w:cs="Arial" w:eastAsia="Arial" w:hAnsi="Arial"/>
+          <w:color w:val="333333"/>
+          <w:sz w:val="20"/>
+          <w:szCs w:val="20"/>
+        </w:rPr>
+        <w:t xml:space="preserve"> (debug).</w:t>
+      </w:r>
+    </w:p>
+    <w:p>
+      <w:pPr>
+        <w:pStyle w:val="ListParagraph"/>
+        <w:numPr>
+          <w:ilvl w:val="0"/>
+          <w:numId w:val="6"/>
+        </w:numPr>
+        <w:spacing w:after="60" w:line="270"/>
+      </w:pPr>
+      <w:r>
+        <w:rPr>
+          <w:rFonts w:ascii="Arial" w:cs="Arial" w:eastAsia="Arial" w:hAnsi="Arial"/>
+          <w:color w:val="333333"/>
+          <w:sz w:val="20"/>
+          <w:szCs w:val="20"/>
+        </w:rPr>
+        <w:t xml:space="preserve">With a free Apple account the app works for 7 days – then install it again with the same command.</w:t>
+      </w:r>
+    </w:p>
+    <w:p>
+      <w:pPr>
+        <w:pStyle w:val="ListParagraph"/>
+        <w:numPr>
+          <w:ilvl w:val="0"/>
+          <w:numId w:val="6"/>
+        </w:numPr>
+        <w:spacing w:after="60" w:line="270"/>
+      </w:pPr>
+      <w:r>
+        <w:rPr>
+          <w:rFonts w:ascii="Arial" w:cs="Arial" w:eastAsia="Arial" w:hAnsi="Arial"/>
+          <w:color w:val="333333"/>
+          <w:sz w:val="20"/>
+          <w:szCs w:val="20"/>
+        </w:rPr>
+        <w:t xml:space="preserve">From Xcode: </w:t>
+      </w:r>
+      <w:r>
+        <w:rPr>
+          <w:rFonts w:ascii="Arial" w:cs="Arial" w:eastAsia="Arial" w:hAnsi="Arial"/>
+          <w:b/>
+          <w:bCs/>
+          <w:color w:val="1E2B28"/>
+          <w:sz w:val="20"/>
+          <w:szCs w:val="20"/>
+        </w:rPr>
+        <w:t xml:space="preserve">Product → Scheme → Edit Scheme… → Run → Build Configuration → Release</w:t>
+      </w:r>
+      <w:r>
+        <w:rPr>
+          <w:rFonts w:ascii="Arial" w:cs="Arial" w:eastAsia="Arial" w:hAnsi="Arial"/>
+          <w:color w:val="333333"/>
+          <w:sz w:val="20"/>
+          <w:szCs w:val="20"/>
+        </w:rPr>
+        <w:t xml:space="preserve">, then </w:t>
+      </w:r>
+      <w:r>
+        <w:rPr>
+          <w:rFonts w:ascii="Arial" w:cs="Arial" w:eastAsia="Arial" w:hAnsi="Arial"/>
+          <w:b/>
+          <w:bCs/>
+          <w:color w:val="1E2B28"/>
+          <w:sz w:val="20"/>
+          <w:szCs w:val="20"/>
+        </w:rPr>
+        <w:t xml:space="preserve">Run</w:t>
+      </w:r>
+      <w:r>
+        <w:rPr>
+          <w:rFonts w:ascii="Arial" w:cs="Arial" w:eastAsia="Arial" w:hAnsi="Arial"/>
+          <w:color w:val="333333"/>
+          <w:sz w:val="20"/>
+          <w:szCs w:val="20"/>
+        </w:rPr>
+        <w:t xml:space="preserve">.</w:t>
+      </w:r>
+    </w:p>
+    <w:p>
+      <w:pPr>
+        <w:pStyle w:val="ListParagraph"/>
+        <w:numPr>
+          <w:ilvl w:val="0"/>
+          <w:numId w:val="6"/>
+        </w:numPr>
+        <w:spacing w:after="60" w:line="270"/>
+      </w:pPr>
+      <w:r>
+        <w:rPr>
+          <w:rFonts w:ascii="Arial" w:cs="Arial" w:eastAsia="Arial" w:hAnsi="Arial"/>
+          <w:color w:val="333333"/>
+          <w:sz w:val="20"/>
+          <w:szCs w:val="20"/>
+        </w:rPr>
+        <w:t xml:space="preserve">Android has no such restriction – a debug APK opens from the home screen.</w:t>
+      </w:r>
+    </w:p>
+    <w:p>
+      <w:pPr>
+        <w:spacing w:after="60"/>
+      </w:pPr>
     </w:p>
     <w:p>
       <w:pPr>
@@ -18059,6 +18486,211 @@
                 <w:shd w:fill="F3F6F5" w:color="auto" w:val="clear"/>
               </w:rPr>
               <w:t xml:space="preserve">ios/Runner/Info.plist</w:t>
+            </w:r>
+            <w:r>
+              <w:rPr>
+                <w:rFonts w:ascii="Arial" w:cs="Arial" w:eastAsia="Arial" w:hAnsi="Arial"/>
+                <w:color w:val="333333"/>
+                <w:sz w:val="18"/>
+                <w:szCs w:val="18"/>
+              </w:rPr>
+              <w:t xml:space="preserve">.</w:t>
+            </w:r>
+          </w:p>
+        </w:tc>
+      </w:tr>
+      <w:tr>
+        <w:trPr>
+          <w:cantSplit/>
+        </w:trPr>
+        <w:tc>
+          <w:tcPr>
+            <w:tcW w:type="dxa" w:w="3600"/>
+            <w:tcBorders>
+              <w:top w:val="single" w:color="D5DDDA" w:sz="4"/>
+              <w:left w:val="single" w:color="D5DDDA" w:sz="4"/>
+              <w:bottom w:val="single" w:color="D5DDDA" w:sz="4"/>
+              <w:right w:val="single" w:color="D5DDDA" w:sz="4"/>
+            </w:tcBorders>
+            <w:shd w:fill="F4FAF8" w:color="auto" w:val="clear"/>
+            <w:tcMar>
+              <w:top w:type="dxa" w:w="60"/>
+              <w:left w:type="dxa" w:w="100"/>
+              <w:bottom w:type="dxa" w:w="60"/>
+              <w:right w:type="dxa" w:w="100"/>
+            </w:tcMar>
+          </w:tcPr>
+          <w:p>
+            <w:pPr>
+              <w:spacing w:after="0" w:before="0" w:line="260"/>
+            </w:pPr>
+            <w:r>
+              <w:rPr>
+                <w:rFonts w:ascii="Arial" w:cs="Arial" w:eastAsia="Arial" w:hAnsi="Arial"/>
+                <w:color w:val="333333"/>
+                <w:sz w:val="18"/>
+                <w:szCs w:val="18"/>
+              </w:rPr>
+              <w:t xml:space="preserve">iPhone: “In iOS 14+, debug mode Flutter apps can only be launched…”</w:t>
+            </w:r>
+          </w:p>
+        </w:tc>
+        <w:tc>
+          <w:tcPr>
+            <w:tcW w:type="dxa" w:w="6038"/>
+            <w:tcBorders>
+              <w:top w:val="single" w:color="D5DDDA" w:sz="4"/>
+              <w:left w:val="single" w:color="D5DDDA" w:sz="4"/>
+              <w:bottom w:val="single" w:color="D5DDDA" w:sz="4"/>
+              <w:right w:val="single" w:color="D5DDDA" w:sz="4"/>
+            </w:tcBorders>
+            <w:shd w:fill="F4FAF8" w:color="auto" w:val="clear"/>
+            <w:tcMar>
+              <w:top w:type="dxa" w:w="60"/>
+              <w:left w:type="dxa" w:w="100"/>
+              <w:bottom w:type="dxa" w:w="60"/>
+              <w:right w:type="dxa" w:w="100"/>
+            </w:tcMar>
+          </w:tcPr>
+          <w:p>
+            <w:pPr>
+              <w:spacing w:after="0" w:before="0" w:line="260"/>
+            </w:pPr>
+            <w:r>
+              <w:rPr>
+                <w:rFonts w:ascii="Arial" w:cs="Arial" w:eastAsia="Arial" w:hAnsi="Arial"/>
+                <w:color w:val="333333"/>
+                <w:sz w:val="18"/>
+                <w:szCs w:val="18"/>
+              </w:rPr>
+              <w:t xml:space="preserve">Install a release build: </w:t>
+            </w:r>
+            <w:r>
+              <w:rPr>
+                <w:rFonts w:ascii="Consolas" w:cs="Consolas" w:eastAsia="Consolas" w:hAnsi="Consolas"/>
+                <w:color w:val="12433C"/>
+                <w:sz w:val="16"/>
+                <w:szCs w:val="16"/>
+                <w:shd w:fill="F3F6F5" w:color="auto" w:val="clear"/>
+              </w:rPr>
+              <w:t xml:space="preserve">flutter run --release -d &lt;ID&gt;</w:t>
+            </w:r>
+            <w:r>
+              <w:rPr>
+                <w:rFonts w:ascii="Arial" w:cs="Arial" w:eastAsia="Arial" w:hAnsi="Arial"/>
+                <w:color w:val="333333"/>
+                <w:sz w:val="18"/>
+                <w:szCs w:val="18"/>
+              </w:rPr>
+              <w:t xml:space="preserve"> (see 12.1).</w:t>
+            </w:r>
+          </w:p>
+        </w:tc>
+      </w:tr>
+      <w:tr>
+        <w:trPr>
+          <w:cantSplit/>
+        </w:trPr>
+        <w:tc>
+          <w:tcPr>
+            <w:tcW w:type="dxa" w:w="3600"/>
+            <w:tcBorders>
+              <w:top w:val="single" w:color="D5DDDA" w:sz="4"/>
+              <w:left w:val="single" w:color="D5DDDA" w:sz="4"/>
+              <w:bottom w:val="single" w:color="D5DDDA" w:sz="4"/>
+              <w:right w:val="single" w:color="D5DDDA" w:sz="4"/>
+            </w:tcBorders>
+            <w:shd w:fill="FFFFFF" w:color="auto" w:val="clear"/>
+            <w:tcMar>
+              <w:top w:type="dxa" w:w="60"/>
+              <w:left w:type="dxa" w:w="100"/>
+              <w:bottom w:type="dxa" w:w="60"/>
+              <w:right w:type="dxa" w:w="100"/>
+            </w:tcMar>
+          </w:tcPr>
+          <w:p>
+            <w:pPr>
+              <w:spacing w:after="0" w:before="0" w:line="260"/>
+            </w:pPr>
+            <w:r>
+              <w:rPr>
+                <w:rFonts w:ascii="Arial" w:cs="Arial" w:eastAsia="Arial" w:hAnsi="Arial"/>
+                <w:color w:val="333333"/>
+                <w:sz w:val="18"/>
+                <w:szCs w:val="18"/>
+              </w:rPr>
+              <w:t xml:space="preserve">Xcode: </w:t>
+            </w:r>
+            <w:r>
+              <w:rPr>
+                <w:rFonts w:ascii="Consolas" w:cs="Consolas" w:eastAsia="Consolas" w:hAnsi="Consolas"/>
+                <w:color w:val="12433C"/>
+                <w:sz w:val="16"/>
+                <w:szCs w:val="16"/>
+                <w:shd w:fill="F3F6F5" w:color="auto" w:val="clear"/>
+              </w:rPr>
+              <w:t xml:space="preserve">could not find included file 'Generated.xcconfig'</w:t>
+            </w:r>
+          </w:p>
+        </w:tc>
+        <w:tc>
+          <w:tcPr>
+            <w:tcW w:type="dxa" w:w="6038"/>
+            <w:tcBorders>
+              <w:top w:val="single" w:color="D5DDDA" w:sz="4"/>
+              <w:left w:val="single" w:color="D5DDDA" w:sz="4"/>
+              <w:bottom w:val="single" w:color="D5DDDA" w:sz="4"/>
+              <w:right w:val="single" w:color="D5DDDA" w:sz="4"/>
+            </w:tcBorders>
+            <w:shd w:fill="FFFFFF" w:color="auto" w:val="clear"/>
+            <w:tcMar>
+              <w:top w:type="dxa" w:w="60"/>
+              <w:left w:type="dxa" w:w="100"/>
+              <w:bottom w:type="dxa" w:w="60"/>
+              <w:right w:type="dxa" w:w="100"/>
+            </w:tcMar>
+          </w:tcPr>
+          <w:p>
+            <w:pPr>
+              <w:spacing w:after="0" w:before="0" w:line="260"/>
+            </w:pPr>
+            <w:r>
+              <w:rPr>
+                <w:rFonts w:ascii="Arial" w:cs="Arial" w:eastAsia="Arial" w:hAnsi="Arial"/>
+                <w:color w:val="333333"/>
+                <w:sz w:val="18"/>
+                <w:szCs w:val="18"/>
+              </w:rPr>
+              <w:t xml:space="preserve">Run </w:t>
+            </w:r>
+            <w:r>
+              <w:rPr>
+                <w:rFonts w:ascii="Consolas" w:cs="Consolas" w:eastAsia="Consolas" w:hAnsi="Consolas"/>
+                <w:color w:val="12433C"/>
+                <w:sz w:val="16"/>
+                <w:szCs w:val="16"/>
+                <w:shd w:fill="F3F6F5" w:color="auto" w:val="clear"/>
+              </w:rPr>
+              <w:t xml:space="preserve">flutter pub get</w:t>
+            </w:r>
+            <w:r>
+              <w:rPr>
+                <w:rFonts w:ascii="Arial" w:cs="Arial" w:eastAsia="Arial" w:hAnsi="Arial"/>
+                <w:color w:val="333333"/>
+                <w:sz w:val="18"/>
+                <w:szCs w:val="18"/>
+              </w:rPr>
+              <w:t xml:space="preserve"> in the project folder first, then open </w:t>
+            </w:r>
+            <w:r>
+              <w:rPr>
+                <w:rFonts w:ascii="Consolas" w:cs="Consolas" w:eastAsia="Consolas" w:hAnsi="Consolas"/>
+                <w:color w:val="12433C"/>
+                <w:sz w:val="16"/>
+                <w:szCs w:val="16"/>
+                <w:shd w:fill="F3F6F5" w:color="auto" w:val="clear"/>
+              </w:rPr>
+              <w:t xml:space="preserve">ios/Runner.xcworkspace</w:t>
             </w:r>
             <w:r>
               <w:rPr>

</xml_diff>